<commit_message>
Report: college banner and SIRAGU watermark on every page, page numbers at the foot
Co-Authored-By: Claude Opus 5.5 (1M context) <noreply@anthropic.com>
</commit_message>
<xml_diff>
--- a/report/PBL_Report_Library_Management_SHELFWISE.docx
+++ b/report/PBL_Report_Library_Management_SHELFWISE.docx
@@ -2088,7 +2088,7 @@
           <w:sz w:val="23"/>
         </w:rPr>
         <w:tab/>
-        <w:t>8</w:t>
+        <w:t>9</w:t>
       </w:r>
     </w:p>
     <w:p>
@@ -2142,7 +2142,7 @@
           <w:sz w:val="23"/>
         </w:rPr>
         <w:tab/>
-        <w:t>9</w:t>
+        <w:t>10</w:t>
       </w:r>
     </w:p>
     <w:p>
@@ -2412,7 +2412,7 @@
           <w:sz w:val="23"/>
         </w:rPr>
         <w:tab/>
-        <w:t>20</w:t>
+        <w:t>21</w:t>
       </w:r>
     </w:p>
     <w:p>
@@ -3080,7 +3080,7 @@
           <w:sz w:val="23"/>
         </w:rPr>
         <w:tab/>
-        <w:t>18</w:t>
+        <w:t>19</w:t>
       </w:r>
     </w:p>
     <w:p>
@@ -3289,7 +3289,7 @@
           <w:sz w:val="23"/>
         </w:rPr>
         <w:tab/>
-        <w:t>17</w:t>
+        <w:t>18</w:t>
       </w:r>
     </w:p>
     <w:p>
@@ -3343,7 +3343,7 @@
           <w:sz w:val="23"/>
         </w:rPr>
         <w:tab/>
-        <w:t>19</w:t>
+        <w:t>20</w:t>
       </w:r>
     </w:p>
     <w:p>
@@ -4436,10 +4436,6 @@
     <w:p>
       <w:pPr>
         <w:sectPr>
-          <w:headerReference w:type="default" r:id="rId15"/>
-          <w:footerReference w:type="default" r:id="rId16"/>
-          <w:headerReference w:type="first" r:id="rId17"/>
-          <w:footerReference w:type="first" r:id="rId18"/>
           <w:pgSz w:w="11906" w:h="16838"/>
           <w:pgMar w:top="1361" w:right="1247" w:bottom="1247" w:left="1701" w:header="454" w:footer="720" w:gutter="0"/>
           <w:cols w:space="720"/>
@@ -7122,7 +7118,7 @@
                     <pic:cNvPicPr/>
                   </pic:nvPicPr>
                   <pic:blipFill>
-                    <a:blip r:embed="rId23"/>
+                    <a:blip r:embed="rId16"/>
                     <a:stretch>
                       <a:fillRect/>
                     </a:stretch>
@@ -7515,7 +7511,7 @@
                     <pic:cNvPicPr/>
                   </pic:nvPicPr>
                   <pic:blipFill>
-                    <a:blip r:embed="rId24"/>
+                    <a:blip r:embed="rId17"/>
                     <a:stretch>
                       <a:fillRect/>
                     </a:stretch>
@@ -8964,7 +8960,7 @@
                     <pic:cNvPicPr/>
                   </pic:nvPicPr>
                   <pic:blipFill>
-                    <a:blip r:embed="rId25"/>
+                    <a:blip r:embed="rId18"/>
                     <a:stretch>
                       <a:fillRect/>
                     </a:stretch>
@@ -9035,7 +9031,7 @@
                     <pic:cNvPicPr/>
                   </pic:nvPicPr>
                   <pic:blipFill>
-                    <a:blip r:embed="rId26"/>
+                    <a:blip r:embed="rId19"/>
                     <a:stretch>
                       <a:fillRect/>
                     </a:stretch>
@@ -9106,7 +9102,7 @@
                     <pic:cNvPicPr/>
                   </pic:nvPicPr>
                   <pic:blipFill>
-                    <a:blip r:embed="rId27"/>
+                    <a:blip r:embed="rId20"/>
                     <a:stretch>
                       <a:fillRect/>
                     </a:stretch>
@@ -9162,7 +9158,7 @@
                     <pic:cNvPicPr/>
                   </pic:nvPicPr>
                   <pic:blipFill>
-                    <a:blip r:embed="rId28"/>
+                    <a:blip r:embed="rId21"/>
                     <a:stretch>
                       <a:fillRect/>
                     </a:stretch>
@@ -9233,7 +9229,7 @@
                     <pic:cNvPicPr/>
                   </pic:nvPicPr>
                   <pic:blipFill>
-                    <a:blip r:embed="rId29"/>
+                    <a:blip r:embed="rId22"/>
                     <a:stretch>
                       <a:fillRect/>
                     </a:stretch>
@@ -9289,7 +9285,7 @@
                     <pic:cNvPicPr/>
                   </pic:nvPicPr>
                   <pic:blipFill>
-                    <a:blip r:embed="rId30"/>
+                    <a:blip r:embed="rId23"/>
                     <a:stretch>
                       <a:fillRect/>
                     </a:stretch>
@@ -11107,7 +11103,7 @@
                     <pic:cNvPicPr/>
                   </pic:nvPicPr>
                   <pic:blipFill>
-                    <a:blip r:embed="rId31"/>
+                    <a:blip r:embed="rId24"/>
                     <a:stretch>
                       <a:fillRect/>
                     </a:stretch>
@@ -11178,7 +11174,7 @@
                     <pic:cNvPicPr/>
                   </pic:nvPicPr>
                   <pic:blipFill>
-                    <a:blip r:embed="rId32"/>
+                    <a:blip r:embed="rId25"/>
                     <a:stretch>
                       <a:fillRect/>
                     </a:stretch>
@@ -11234,7 +11230,7 @@
                     <pic:cNvPicPr/>
                   </pic:nvPicPr>
                   <pic:blipFill>
-                    <a:blip r:embed="rId33"/>
+                    <a:blip r:embed="rId26"/>
                     <a:stretch>
                       <a:fillRect/>
                     </a:stretch>
@@ -11796,7 +11792,7 @@
                     <pic:cNvPicPr/>
                   </pic:nvPicPr>
                   <pic:blipFill>
-                    <a:blip r:embed="rId34"/>
+                    <a:blip r:embed="rId27"/>
                     <a:stretch>
                       <a:fillRect/>
                     </a:stretch>
@@ -14341,7 +14337,7 @@
                     <pic:cNvPicPr/>
                   </pic:nvPicPr>
                   <pic:blipFill>
-                    <a:blip r:embed="rId35"/>
+                    <a:blip r:embed="rId28"/>
                     <a:stretch>
                       <a:fillRect/>
                     </a:stretch>
@@ -14361,10 +14357,7 @@
       </w:r>
     </w:p>
     <w:sectPr>
-      <w:headerReference w:type="default" r:id="rId19"/>
-      <w:footerReference w:type="default" r:id="rId20"/>
-      <w:headerReference w:type="first" r:id="rId21"/>
-      <w:footerReference w:type="first" r:id="rId22"/>
+      <w:footerReference w:type="default" r:id="rId15"/>
       <w:pgSz w:w="11906" w:h="16838"/>
       <w:pgMar w:top="1361" w:right="1247" w:bottom="1247" w:left="1701" w:header="454" w:footer="720" w:gutter="0"/>
       <w:cols w:space="720"/>
@@ -14400,37 +14393,16 @@
   <w:p>
     <w:pPr>
       <w:pStyle w:val="Footer"/>
+      <w:jc w:val="center"/>
     </w:pPr>
-  </w:p>
-</w:ftr>
-</file>
-
-<file path=word/footer4.xml><?xml version="1.0" encoding="utf-8"?>
-<w:ftr xmlns:m="http://schemas.openxmlformats.org/officeDocument/2006/math" xmlns:mc="http://schemas.openxmlformats.org/markup-compatibility/2006" xmlns:mo="http://schemas.microsoft.com/office/mac/office/2008/main" xmlns:mv="urn:schemas-microsoft-com:mac:vml" xmlns:o="urn:schemas-microsoft-com:office:office" xmlns:r="http://schemas.openxmlformats.org/officeDocument/2006/relationships" xmlns:v="urn:schemas-microsoft-com:vml" xmlns:w10="urn:schemas-microsoft-com:office:word" xmlns:w14="http://schemas.microsoft.com/office/word/2010/wordml" xmlns:w="http://schemas.openxmlformats.org/wordprocessingml/2006/main" xmlns:wne="http://schemas.microsoft.com/office/word/2006/wordml" xmlns:wp14="http://schemas.microsoft.com/office/word/2010/wordprocessingDrawing" xmlns:wp="http://schemas.openxmlformats.org/drawingml/2006/wordprocessingDrawing" xmlns:wpc="http://schemas.microsoft.com/office/word/2010/wordprocessingCanvas" xmlns:wpg="http://schemas.microsoft.com/office/word/2010/wordprocessingGroup" xmlns:wpi="http://schemas.microsoft.com/office/word/2010/wordprocessingInk" xmlns:wps="http://schemas.microsoft.com/office/word/2010/wordprocessingShape" mc:Ignorable="w14 wp14">
-  <w:p>
-    <w:pPr>
-      <w:pStyle w:val="Footer"/>
-    </w:pPr>
-  </w:p>
-</w:ftr>
-</file>
-
-<file path=word/footer5.xml><?xml version="1.0" encoding="utf-8"?>
-<w:ftr xmlns:m="http://schemas.openxmlformats.org/officeDocument/2006/math" xmlns:mc="http://schemas.openxmlformats.org/markup-compatibility/2006" xmlns:mo="http://schemas.microsoft.com/office/mac/office/2008/main" xmlns:mv="urn:schemas-microsoft-com:mac:vml" xmlns:o="urn:schemas-microsoft-com:office:office" xmlns:r="http://schemas.openxmlformats.org/officeDocument/2006/relationships" xmlns:v="urn:schemas-microsoft-com:vml" xmlns:w10="urn:schemas-microsoft-com:office:word" xmlns:w14="http://schemas.microsoft.com/office/word/2010/wordml" xmlns:w="http://schemas.openxmlformats.org/wordprocessingml/2006/main" xmlns:wne="http://schemas.microsoft.com/office/word/2006/wordml" xmlns:wp14="http://schemas.microsoft.com/office/word/2010/wordprocessingDrawing" xmlns:wp="http://schemas.openxmlformats.org/drawingml/2006/wordprocessingDrawing" xmlns:wpc="http://schemas.microsoft.com/office/word/2010/wordprocessingCanvas" xmlns:wpg="http://schemas.microsoft.com/office/word/2010/wordprocessingGroup" xmlns:wpi="http://schemas.microsoft.com/office/word/2010/wordprocessingInk" xmlns:wps="http://schemas.microsoft.com/office/word/2010/wordprocessingShape" mc:Ignorable="w14 wp14">
-  <w:p>
-    <w:pPr>
-      <w:pStyle w:val="Footer"/>
-    </w:pPr>
-  </w:p>
-</w:ftr>
-</file>
-
-<file path=word/footer6.xml><?xml version="1.0" encoding="utf-8"?>
-<w:ftr xmlns:m="http://schemas.openxmlformats.org/officeDocument/2006/math" xmlns:mc="http://schemas.openxmlformats.org/markup-compatibility/2006" xmlns:mo="http://schemas.microsoft.com/office/mac/office/2008/main" xmlns:mv="urn:schemas-microsoft-com:mac:vml" xmlns:o="urn:schemas-microsoft-com:office:office" xmlns:r="http://schemas.openxmlformats.org/officeDocument/2006/relationships" xmlns:v="urn:schemas-microsoft-com:vml" xmlns:w10="urn:schemas-microsoft-com:office:word" xmlns:w14="http://schemas.microsoft.com/office/word/2010/wordml" xmlns:w="http://schemas.openxmlformats.org/wordprocessingml/2006/main" xmlns:wne="http://schemas.microsoft.com/office/word/2006/wordml" xmlns:wp14="http://schemas.microsoft.com/office/word/2010/wordprocessingDrawing" xmlns:wp="http://schemas.openxmlformats.org/drawingml/2006/wordprocessingDrawing" xmlns:wpc="http://schemas.microsoft.com/office/word/2010/wordprocessingCanvas" xmlns:wpg="http://schemas.microsoft.com/office/word/2010/wordprocessingGroup" xmlns:wpi="http://schemas.microsoft.com/office/word/2010/wordprocessingInk" xmlns:wps="http://schemas.microsoft.com/office/word/2010/wordprocessingShape" mc:Ignorable="w14 wp14">
-  <w:p>
-    <w:pPr>
-      <w:pStyle w:val="Footer"/>
-    </w:pPr>
+    <w:r>
+      <w:rPr>
+        <w:sz w:val="24"/>
+      </w:rPr>
+      <w:fldChar w:fldCharType="begin"/>
+      <w:instrText xml:space="preserve">PAGE</w:instrText>
+      <w:fldChar w:fldCharType="end"/>
+    </w:r>
   </w:p>
 </w:ftr>
 </file>
@@ -14524,55 +14496,6 @@
 </file>
 
 <file path=word/header2.xml><?xml version="1.0" encoding="utf-8"?>
-<w:hdr xmlns:m="http://schemas.openxmlformats.org/officeDocument/2006/math" xmlns:mc="http://schemas.openxmlformats.org/markup-compatibility/2006" xmlns:mo="http://schemas.microsoft.com/office/mac/office/2008/main" xmlns:mv="urn:schemas-microsoft-com:mac:vml" xmlns:o="urn:schemas-microsoft-com:office:office" xmlns:r="http://schemas.openxmlformats.org/officeDocument/2006/relationships" xmlns:v="urn:schemas-microsoft-com:vml" xmlns:w10="urn:schemas-microsoft-com:office:word" xmlns:w14="http://schemas.microsoft.com/office/word/2010/wordml" xmlns:w="http://schemas.openxmlformats.org/wordprocessingml/2006/main" xmlns:wne="http://schemas.microsoft.com/office/word/2006/wordml" xmlns:wp14="http://schemas.microsoft.com/office/word/2010/wordprocessingDrawing" xmlns:wp="http://schemas.openxmlformats.org/drawingml/2006/wordprocessingDrawing" xmlns:wpc="http://schemas.microsoft.com/office/word/2010/wordprocessingCanvas" xmlns:wpg="http://schemas.microsoft.com/office/word/2010/wordprocessingGroup" xmlns:wpi="http://schemas.microsoft.com/office/word/2010/wordprocessingInk" xmlns:wps="http://schemas.microsoft.com/office/word/2010/wordprocessingShape" mc:Ignorable="w14 wp14">
-  <w:p>
-    <w:pPr>
-      <w:pStyle w:val="Header"/>
-    </w:pPr>
-  </w:p>
-</w:hdr>
-</file>
-
-<file path=word/header3.xml><?xml version="1.0" encoding="utf-8"?>
-<w:hdr xmlns:m="http://schemas.openxmlformats.org/officeDocument/2006/math" xmlns:mc="http://schemas.openxmlformats.org/markup-compatibility/2006" xmlns:mo="http://schemas.microsoft.com/office/mac/office/2008/main" xmlns:mv="urn:schemas-microsoft-com:mac:vml" xmlns:o="urn:schemas-microsoft-com:office:office" xmlns:r="http://schemas.openxmlformats.org/officeDocument/2006/relationships" xmlns:v="urn:schemas-microsoft-com:vml" xmlns:w10="urn:schemas-microsoft-com:office:word" xmlns:w14="http://schemas.microsoft.com/office/word/2010/wordml" xmlns:w="http://schemas.openxmlformats.org/wordprocessingml/2006/main" xmlns:wne="http://schemas.microsoft.com/office/word/2006/wordml" xmlns:wp14="http://schemas.microsoft.com/office/word/2010/wordprocessingDrawing" xmlns:wp="http://schemas.openxmlformats.org/drawingml/2006/wordprocessingDrawing" xmlns:wpc="http://schemas.microsoft.com/office/word/2010/wordprocessingCanvas" xmlns:wpg="http://schemas.microsoft.com/office/word/2010/wordprocessingGroup" xmlns:wpi="http://schemas.microsoft.com/office/word/2010/wordprocessingInk" xmlns:wps="http://schemas.microsoft.com/office/word/2010/wordprocessingShape" mc:Ignorable="w14 wp14">
-  <w:p>
-    <w:pPr>
-      <w:pStyle w:val="Header"/>
-    </w:pPr>
-  </w:p>
-</w:hdr>
-</file>
-
-<file path=word/header4.xml><?xml version="1.0" encoding="utf-8"?>
-<w:hdr xmlns:m="http://schemas.openxmlformats.org/officeDocument/2006/math" xmlns:mc="http://schemas.openxmlformats.org/markup-compatibility/2006" xmlns:mo="http://schemas.microsoft.com/office/mac/office/2008/main" xmlns:mv="urn:schemas-microsoft-com:mac:vml" xmlns:o="urn:schemas-microsoft-com:office:office" xmlns:r="http://schemas.openxmlformats.org/officeDocument/2006/relationships" xmlns:v="urn:schemas-microsoft-com:vml" xmlns:w10="urn:schemas-microsoft-com:office:word" xmlns:w14="http://schemas.microsoft.com/office/word/2010/wordml" xmlns:w="http://schemas.openxmlformats.org/wordprocessingml/2006/main" xmlns:wne="http://schemas.microsoft.com/office/word/2006/wordml" xmlns:wp14="http://schemas.microsoft.com/office/word/2010/wordprocessingDrawing" xmlns:wp="http://schemas.openxmlformats.org/drawingml/2006/wordprocessingDrawing" xmlns:wpc="http://schemas.microsoft.com/office/word/2010/wordprocessingCanvas" xmlns:wpg="http://schemas.microsoft.com/office/word/2010/wordprocessingGroup" xmlns:wpi="http://schemas.microsoft.com/office/word/2010/wordprocessingInk" xmlns:wps="http://schemas.microsoft.com/office/word/2010/wordprocessingShape" mc:Ignorable="w14 wp14">
-  <w:p>
-    <w:pPr>
-      <w:pStyle w:val="Header"/>
-    </w:pPr>
-  </w:p>
-</w:hdr>
-</file>
-
-<file path=word/header5.xml><?xml version="1.0" encoding="utf-8"?>
-<w:hdr xmlns:m="http://schemas.openxmlformats.org/officeDocument/2006/math" xmlns:mc="http://schemas.openxmlformats.org/markup-compatibility/2006" xmlns:mo="http://schemas.microsoft.com/office/mac/office/2008/main" xmlns:mv="urn:schemas-microsoft-com:mac:vml" xmlns:o="urn:schemas-microsoft-com:office:office" xmlns:r="http://schemas.openxmlformats.org/officeDocument/2006/relationships" xmlns:v="urn:schemas-microsoft-com:vml" xmlns:w10="urn:schemas-microsoft-com:office:word" xmlns:w14="http://schemas.microsoft.com/office/word/2010/wordml" xmlns:w="http://schemas.openxmlformats.org/wordprocessingml/2006/main" xmlns:wne="http://schemas.microsoft.com/office/word/2006/wordml" xmlns:wp14="http://schemas.microsoft.com/office/word/2010/wordprocessingDrawing" xmlns:wp="http://schemas.openxmlformats.org/drawingml/2006/wordprocessingDrawing" xmlns:wpc="http://schemas.microsoft.com/office/word/2010/wordprocessingCanvas" xmlns:wpg="http://schemas.microsoft.com/office/word/2010/wordprocessingGroup" xmlns:wpi="http://schemas.microsoft.com/office/word/2010/wordprocessingInk" xmlns:wps="http://schemas.microsoft.com/office/word/2010/wordprocessingShape" mc:Ignorable="w14 wp14">
-  <w:p>
-    <w:pPr>
-      <w:pStyle w:val="Header"/>
-      <w:jc w:val="center"/>
-    </w:pPr>
-    <w:r>
-      <w:rPr>
-        <w:sz w:val="24"/>
-      </w:rPr>
-      <w:fldChar w:fldCharType="begin"/>
-      <w:instrText xml:space="preserve">PAGE</w:instrText>
-      <w:fldChar w:fldCharType="end"/>
-    </w:r>
-  </w:p>
-</w:hdr>
-</file>
-
-<file path=word/header6.xml><?xml version="1.0" encoding="utf-8"?>
 <w:hdr xmlns:m="http://schemas.openxmlformats.org/officeDocument/2006/math" xmlns:mc="http://schemas.openxmlformats.org/markup-compatibility/2006" xmlns:mo="http://schemas.microsoft.com/office/mac/office/2008/main" xmlns:mv="urn:schemas-microsoft-com:mac:vml" xmlns:o="urn:schemas-microsoft-com:office:office" xmlns:r="http://schemas.openxmlformats.org/officeDocument/2006/relationships" xmlns:v="urn:schemas-microsoft-com:vml" xmlns:w10="urn:schemas-microsoft-com:office:word" xmlns:w14="http://schemas.microsoft.com/office/word/2010/wordml" xmlns:w="http://schemas.openxmlformats.org/wordprocessingml/2006/main" xmlns:wne="http://schemas.microsoft.com/office/word/2006/wordml" xmlns:wp14="http://schemas.microsoft.com/office/word/2010/wordprocessingDrawing" xmlns:wp="http://schemas.openxmlformats.org/drawingml/2006/wordprocessingDrawing" xmlns:wpc="http://schemas.microsoft.com/office/word/2010/wordprocessingCanvas" xmlns:wpg="http://schemas.microsoft.com/office/word/2010/wordprocessingGroup" xmlns:wpi="http://schemas.microsoft.com/office/word/2010/wordprocessingInk" xmlns:wps="http://schemas.microsoft.com/office/word/2010/wordprocessingShape" mc:Ignorable="w14 wp14">
   <w:p>
     <w:pPr>

</xml_diff>

<commit_message>
Report: correct mentor, project co-ordinator and class advisors
Co-Authored-By: Claude Opus 5.5 (1M context) <noreply@anthropic.com>
</commit_message>
<xml_diff>
--- a/report/PBL_Report_Library_Management_SHELFWISE.docx
+++ b/report/PBL_Report_Library_Management_SHELFWISE.docx
@@ -970,7 +970,7 @@
                 <w:i w:val="0"/>
                 <w:sz w:val="25"/>
               </w:rPr>
-              <w:t>Ms. S. RAJA PRIYA, M.E.,</w:t>
+              <w:t>Ms. SWATHI L,</w:t>
             </w:r>
           </w:p>
           <w:p>
@@ -1445,7 +1445,7 @@
           <w:i w:val="0"/>
           <w:sz w:val="24"/>
         </w:rPr>
-        <w:t>Ms. S. RAJA PRIYA M.E.,</w:t>
+        <w:t>R. POORNIMA LAKSHMI, M.E., Assistant Professor,</w:t>
       </w:r>
       <w:r>
         <w:rPr>
@@ -1478,7 +1478,7 @@
           <w:i w:val="0"/>
           <w:sz w:val="24"/>
         </w:rPr>
-        <w:t>Ms. S. RAJA PRIYA M.E.,</w:t>
+        <w:t>Dr. G. IRIN LORETTA, M.E., Assistant Professor,</w:t>
       </w:r>
       <w:r>
         <w:rPr>
@@ -1496,7 +1496,7 @@
           <w:i w:val="0"/>
           <w:sz w:val="24"/>
         </w:rPr>
-        <w:t>Mr. R. RAHUL M.TECH.,</w:t>
+        <w:t>S. E. NEELA KANDAN, M.Tech., Assistant Professor,</w:t>
       </w:r>
       <w:r>
         <w:rPr>
@@ -1505,7 +1505,7 @@
           <w:i w:val="0"/>
           <w:sz w:val="24"/>
         </w:rPr>
-        <w:t xml:space="preserve"> of the Department of Computer Science and Engineering for their valuable suggestions and support toward the successful completion of the project.</w:t>
+        <w:t xml:space="preserve"> of the Department of Computer Science and Engineering and others for providing valuable suggestions and for the successful completion of the project.</w:t>
       </w:r>
     </w:p>
     <w:p>

</xml_diff>